<commit_message>
feat: Add multi-asset support (Forex, JPY, Gold, Crypto), dynamic precision formatting, and fix reset button handlers
</commit_message>
<xml_diff>
--- a/ProjectReport.docx
+++ b/ProjectReport.docx
@@ -26378,17 +26378,7 @@
           <w:lang w:val="en-IN"/>
         </w:rPr>
         <w:lastRenderedPageBreak/>
-        <w:t xml:space="preserve">5.1 </w:t>
-      </w:r>
-      <w:r>
-        <w:rPr>
-          <w:b/>
-          <w:bCs/>
-          <w:sz w:val="24"/>
-          <w:szCs w:val="24"/>
-          <w:lang w:val="en-IN"/>
-        </w:rPr>
-        <w:t>INTRODUCTION</w:t>
+        <w:t>5.1 INTRODUCTION</w:t>
       </w:r>
     </w:p>
     <w:p>
@@ -26448,17 +26438,7 @@
           <w:szCs w:val="24"/>
           <w:lang w:val="en-IN"/>
         </w:rPr>
-        <w:t xml:space="preserve">5.2 </w:t>
-      </w:r>
-      <w:r>
-        <w:rPr>
-          <w:b/>
-          <w:bCs/>
-          <w:sz w:val="24"/>
-          <w:szCs w:val="24"/>
-          <w:lang w:val="en-IN"/>
-        </w:rPr>
-        <w:t>CODING</w:t>
+        <w:t>5.2 CODING</w:t>
       </w:r>
     </w:p>
     <w:p>
@@ -26654,17 +26634,7 @@
           <w:lang w:val="en-IN"/>
         </w:rPr>
         <w:lastRenderedPageBreak/>
-        <w:t xml:space="preserve">5.3 </w:t>
-      </w:r>
-      <w:r>
-        <w:rPr>
-          <w:b/>
-          <w:bCs/>
-          <w:sz w:val="24"/>
-          <w:szCs w:val="24"/>
-          <w:lang w:val="en-IN"/>
-        </w:rPr>
-        <w:t>DEBUGGING</w:t>
+        <w:t>5.3 DEBUGGING</w:t>
       </w:r>
     </w:p>
     <w:p>
@@ -26860,17 +26830,7 @@
           <w:szCs w:val="24"/>
           <w:lang w:val="en-IN"/>
         </w:rPr>
-        <w:t xml:space="preserve">5.4 </w:t>
-      </w:r>
-      <w:r>
-        <w:rPr>
-          <w:b/>
-          <w:bCs/>
-          <w:sz w:val="24"/>
-          <w:szCs w:val="24"/>
-          <w:lang w:val="en-IN"/>
-        </w:rPr>
-        <w:t>UNIT TESTING</w:t>
+        <w:t>5.4 UNIT TESTING</w:t>
       </w:r>
     </w:p>
     <w:p>
@@ -27434,17 +27394,7 @@
           <w:lang w:val="en-IN"/>
         </w:rPr>
         <w:lastRenderedPageBreak/>
-        <w:t xml:space="preserve">6.1 </w:t>
-      </w:r>
-      <w:r>
-        <w:rPr>
-          <w:b/>
-          <w:bCs/>
-          <w:sz w:val="24"/>
-          <w:szCs w:val="24"/>
-          <w:lang w:val="en-IN"/>
-        </w:rPr>
-        <w:t>INTRODUCTION</w:t>
+        <w:t>6.1 INTRODUCTION</w:t>
       </w:r>
     </w:p>
     <w:p>
@@ -27524,17 +27474,7 @@
           <w:szCs w:val="24"/>
           <w:lang w:val="en-IN"/>
         </w:rPr>
-        <w:t xml:space="preserve">6.2 </w:t>
-      </w:r>
-      <w:r>
-        <w:rPr>
-          <w:b/>
-          <w:bCs/>
-          <w:sz w:val="24"/>
-          <w:szCs w:val="24"/>
-          <w:lang w:val="en-IN"/>
-        </w:rPr>
-        <w:t>PLANNING SOFTWARE PROJECT</w:t>
+        <w:t>6.2 PLANNING SOFTWARE PROJECT</w:t>
       </w:r>
     </w:p>
     <w:p>
@@ -27910,17 +27850,7 @@
           <w:szCs w:val="24"/>
           <w:lang w:val="en-IN"/>
         </w:rPr>
-        <w:t xml:space="preserve">6.3 </w:t>
-      </w:r>
-      <w:r>
-        <w:rPr>
-          <w:b/>
-          <w:bCs/>
-          <w:sz w:val="24"/>
-          <w:szCs w:val="24"/>
-          <w:lang w:val="en-IN"/>
-        </w:rPr>
-        <w:t>GANTT CHART</w:t>
+        <w:t>6.3 GANTT CHART</w:t>
       </w:r>
     </w:p>
     <w:p>
@@ -31137,17 +31067,7 @@
           <w:szCs w:val="24"/>
           <w:lang w:val="en-IN"/>
         </w:rPr>
-        <w:t xml:space="preserve">6.4 </w:t>
-      </w:r>
-      <w:r>
-        <w:rPr>
-          <w:b/>
-          <w:bCs/>
-          <w:sz w:val="24"/>
-          <w:szCs w:val="24"/>
-          <w:lang w:val="en-IN"/>
-        </w:rPr>
-        <w:t>PERT CHART</w:t>
+        <w:t>6.4 PERT CHART</w:t>
       </w:r>
     </w:p>
     <w:p>
@@ -33788,17 +33708,7 @@
           <w:lang w:val="en-IN"/>
         </w:rPr>
         <w:lastRenderedPageBreak/>
-        <w:t xml:space="preserve">8.1 </w:t>
-      </w:r>
-      <w:r>
-        <w:rPr>
-          <w:b/>
-          <w:bCs/>
-          <w:sz w:val="24"/>
-          <w:szCs w:val="24"/>
-          <w:lang w:val="en-IN"/>
-        </w:rPr>
-        <w:t>INTRODUCTION</w:t>
+        <w:t>8.1 INTRODUCTION</w:t>
       </w:r>
     </w:p>
     <w:p>
@@ -33882,17 +33792,7 @@
           <w:szCs w:val="24"/>
           <w:lang w:val="en-IN"/>
         </w:rPr>
-        <w:t xml:space="preserve">8.2 </w:t>
-      </w:r>
-      <w:r>
-        <w:rPr>
-          <w:b/>
-          <w:bCs/>
-          <w:sz w:val="24"/>
-          <w:szCs w:val="24"/>
-          <w:lang w:val="en-IN"/>
-        </w:rPr>
-        <w:t>TESTING PROCEDURES</w:t>
+        <w:t>8.2 TESTING PROCEDURES</w:t>
       </w:r>
     </w:p>
     <w:p>
@@ -33956,17 +33856,7 @@
           <w:szCs w:val="24"/>
           <w:lang w:val="en-IN"/>
         </w:rPr>
-        <w:t xml:space="preserve">8.2.1 </w:t>
-      </w:r>
-      <w:r>
-        <w:rPr>
-          <w:b/>
-          <w:bCs/>
-          <w:sz w:val="24"/>
-          <w:szCs w:val="24"/>
-          <w:lang w:val="en-IN"/>
-        </w:rPr>
-        <w:t>UNIT TESTING</w:t>
+        <w:t>8.2.1 UNIT TESTING</w:t>
       </w:r>
       <w:r>
         <w:rPr>
@@ -34191,17 +34081,7 @@
           <w:szCs w:val="24"/>
           <w:lang w:val="en-IN"/>
         </w:rPr>
-        <w:t xml:space="preserve">8.2.2 </w:t>
-      </w:r>
-      <w:r>
-        <w:rPr>
-          <w:b/>
-          <w:bCs/>
-          <w:sz w:val="24"/>
-          <w:szCs w:val="24"/>
-          <w:lang w:val="en-IN"/>
-        </w:rPr>
-        <w:t>INTEGRATION TESTING</w:t>
+        <w:t>8.2.2 INTEGRATION TESTING</w:t>
       </w:r>
     </w:p>
     <w:p>
@@ -34337,17 +34217,7 @@
           <w:szCs w:val="24"/>
           <w:lang w:val="en-IN"/>
         </w:rPr>
-        <w:t xml:space="preserve">8.2.3 </w:t>
-      </w:r>
-      <w:r>
-        <w:rPr>
-          <w:b/>
-          <w:bCs/>
-          <w:sz w:val="24"/>
-          <w:szCs w:val="24"/>
-          <w:lang w:val="en-IN"/>
-        </w:rPr>
-        <w:t>SYSTEM AND END-TO-END TESTING</w:t>
+        <w:t>8.2.3 SYSTEM AND END-TO-END TESTING</w:t>
       </w:r>
     </w:p>
     <w:p>
@@ -34528,17 +34398,7 @@
           <w:szCs w:val="24"/>
           <w:lang w:val="en-IN"/>
         </w:rPr>
-        <w:t xml:space="preserve">8.2.4 </w:t>
-      </w:r>
-      <w:r>
-        <w:rPr>
-          <w:b/>
-          <w:bCs/>
-          <w:sz w:val="24"/>
-          <w:szCs w:val="24"/>
-          <w:lang w:val="en-IN"/>
-        </w:rPr>
-        <w:t>PERFORMANCE AND DATABASE TESTING</w:t>
+        <w:t>8.2.4 PERFORMANCE AND DATABASE TESTING</w:t>
       </w:r>
       <w:r>
         <w:rPr>
@@ -35027,17 +34887,7 @@
           <w:lang w:val="en-IN"/>
         </w:rPr>
         <w:lastRenderedPageBreak/>
-        <w:t xml:space="preserve">9.1 </w:t>
-      </w:r>
-      <w:r>
-        <w:rPr>
-          <w:b/>
-          <w:bCs/>
-          <w:sz w:val="24"/>
-          <w:szCs w:val="24"/>
-          <w:lang w:val="en-IN"/>
-        </w:rPr>
-        <w:t>INTRODUCTION</w:t>
+        <w:t>9.1 INTRODUCTION</w:t>
       </w:r>
     </w:p>
     <w:p>
@@ -35121,17 +34971,7 @@
           <w:szCs w:val="24"/>
           <w:lang w:val="en-IN"/>
         </w:rPr>
-        <w:t xml:space="preserve">9.2 </w:t>
-      </w:r>
-      <w:r>
-        <w:rPr>
-          <w:b/>
-          <w:bCs/>
-          <w:sz w:val="24"/>
-          <w:szCs w:val="24"/>
-          <w:lang w:val="en-IN"/>
-        </w:rPr>
-        <w:t>MAINTENANCE</w:t>
+        <w:t>9.2 MAINTENANCE</w:t>
       </w:r>
     </w:p>
     <w:p>
@@ -35195,17 +35035,7 @@
           <w:szCs w:val="24"/>
           <w:lang w:val="en-IN"/>
         </w:rPr>
-        <w:t xml:space="preserve">9.2.1 </w:t>
-      </w:r>
-      <w:r>
-        <w:rPr>
-          <w:b/>
-          <w:bCs/>
-          <w:sz w:val="24"/>
-          <w:szCs w:val="24"/>
-          <w:lang w:val="en-IN"/>
-        </w:rPr>
-        <w:t>CORRECTIVE MAINTENANCE</w:t>
+        <w:t>9.2.1 CORRECTIVE MAINTENANCE</w:t>
       </w:r>
     </w:p>
     <w:p>
@@ -35450,17 +35280,7 @@
           <w:szCs w:val="24"/>
           <w:lang w:val="en-IN"/>
         </w:rPr>
-        <w:t xml:space="preserve">9.2.2 </w:t>
-      </w:r>
-      <w:r>
-        <w:rPr>
-          <w:b/>
-          <w:bCs/>
-          <w:sz w:val="24"/>
-          <w:szCs w:val="24"/>
-          <w:lang w:val="en-IN"/>
-        </w:rPr>
-        <w:t>ADAPTIVE MAINTENANCE</w:t>
+        <w:t>9.2.2 ADAPTIVE MAINTENANCE</w:t>
       </w:r>
     </w:p>
     <w:p>
@@ -35614,17 +35434,7 @@
           <w:szCs w:val="24"/>
           <w:lang w:val="en-IN"/>
         </w:rPr>
-        <w:t xml:space="preserve">9.2.3 </w:t>
-      </w:r>
-      <w:r>
-        <w:rPr>
-          <w:b/>
-          <w:bCs/>
-          <w:sz w:val="24"/>
-          <w:szCs w:val="24"/>
-          <w:lang w:val="en-IN"/>
-        </w:rPr>
-        <w:t>PERFECTIVE MAINTENANCE</w:t>
+        <w:t>9.2.3 PERFECTIVE MAINTENANCE</w:t>
       </w:r>
     </w:p>
     <w:p>
@@ -35797,17 +35607,7 @@
           <w:szCs w:val="24"/>
           <w:lang w:val="en-IN"/>
         </w:rPr>
-        <w:t xml:space="preserve">9.2.4 </w:t>
-      </w:r>
-      <w:r>
-        <w:rPr>
-          <w:b/>
-          <w:bCs/>
-          <w:sz w:val="24"/>
-          <w:szCs w:val="24"/>
-          <w:lang w:val="en-IN"/>
-        </w:rPr>
-        <w:t>PREVENTIVE MAINTENANCE</w:t>
+        <w:t>9.2.4 PREVENTIVE MAINTENANCE</w:t>
       </w:r>
     </w:p>
     <w:p>
@@ -36493,17 +36293,7 @@
           <w:szCs w:val="24"/>
           <w:lang w:val="en-IN"/>
         </w:rPr>
-        <w:t xml:space="preserve">10.2 </w:t>
-      </w:r>
-      <w:r>
-        <w:rPr>
-          <w:b/>
-          <w:bCs/>
-          <w:sz w:val="24"/>
-          <w:szCs w:val="24"/>
-          <w:lang w:val="en-IN"/>
-        </w:rPr>
-        <w:t>OPERATING SYSTEM LEVEL SECURITY</w:t>
+        <w:t>10.2 OPERATING SYSTEM LEVEL SECURITY</w:t>
       </w:r>
     </w:p>
     <w:p>
@@ -36750,17 +36540,7 @@
           <w:lang w:val="en-IN"/>
         </w:rPr>
         <w:lastRenderedPageBreak/>
-        <w:t xml:space="preserve">10.3 </w:t>
-      </w:r>
-      <w:r>
-        <w:rPr>
-          <w:b/>
-          <w:bCs/>
-          <w:sz w:val="24"/>
-          <w:szCs w:val="24"/>
-          <w:lang w:val="en-IN"/>
-        </w:rPr>
-        <w:t>DATABASE LEVEL SECURITY</w:t>
+        <w:t>10.3 DATABASE LEVEL SECURITY</w:t>
       </w:r>
     </w:p>
     <w:p>
@@ -37008,17 +36788,7 @@
           <w:szCs w:val="24"/>
           <w:lang w:val="en-IN"/>
         </w:rPr>
-        <w:t xml:space="preserve">10.4 </w:t>
-      </w:r>
-      <w:r>
-        <w:rPr>
-          <w:b/>
-          <w:bCs/>
-          <w:sz w:val="24"/>
-          <w:szCs w:val="24"/>
-          <w:lang w:val="en-IN"/>
-        </w:rPr>
-        <w:t>SYSTEM LEVEL SECURITY</w:t>
+        <w:t>10.4 SYSTEM LEVEL SECURITY</w:t>
       </w:r>
     </w:p>
     <w:p>
@@ -37708,17 +37478,7 @@
           <w:lang w:val="en-IN"/>
         </w:rPr>
         <w:lastRenderedPageBreak/>
-        <w:t xml:space="preserve">11.1 </w:t>
-      </w:r>
-      <w:r>
-        <w:rPr>
-          <w:b/>
-          <w:bCs/>
-          <w:sz w:val="24"/>
-          <w:szCs w:val="24"/>
-          <w:lang w:val="en-IN"/>
-        </w:rPr>
-        <w:t>INTRODUCTION</w:t>
+        <w:t>11.1 INTRODUCTION</w:t>
       </w:r>
     </w:p>
     <w:p>
@@ -37802,17 +37562,7 @@
           <w:szCs w:val="24"/>
           <w:lang w:val="en-IN"/>
         </w:rPr>
-        <w:t xml:space="preserve">11.2 </w:t>
-      </w:r>
-      <w:r>
-        <w:rPr>
-          <w:b/>
-          <w:bCs/>
-          <w:sz w:val="24"/>
-          <w:szCs w:val="24"/>
-          <w:lang w:val="en-IN"/>
-        </w:rPr>
-        <w:t>MULTI-ASSET EXPANSION AND DEDICATED GOLD (XAU/USD) OPTIMIZATION</w:t>
+        <w:t>11.2 MULTI-ASSET EXPANSION AND DEDICATED GOLD (XAU/USD) OPTIMIZATION</w:t>
       </w:r>
     </w:p>
     <w:p>
@@ -37878,17 +37628,7 @@
           <w:szCs w:val="24"/>
           <w:lang w:val="en-IN"/>
         </w:rPr>
-        <w:t xml:space="preserve">11.3 </w:t>
-      </w:r>
-      <w:r>
-        <w:rPr>
-          <w:b/>
-          <w:bCs/>
-          <w:sz w:val="24"/>
-          <w:szCs w:val="24"/>
-          <w:lang w:val="en-IN"/>
-        </w:rPr>
-        <w:t>ADVANCED STRATEGY SCRIPTING AND CUSTOM INDICATORS</w:t>
+        <w:t>11.3 ADVANCED STRATEGY SCRIPTING AND CUSTOM INDICATORS</w:t>
       </w:r>
     </w:p>
     <w:p>
@@ -37955,17 +37695,7 @@
           <w:lang w:val="en-IN"/>
         </w:rPr>
         <w:lastRenderedPageBreak/>
-        <w:t>11.</w:t>
-      </w:r>
-      <w:r>
-        <w:rPr>
-          <w:b/>
-          <w:bCs/>
-          <w:sz w:val="24"/>
-          <w:szCs w:val="24"/>
-          <w:lang w:val="en-IN"/>
-        </w:rPr>
-        <w:t>4 ANALYTICAL TRADE JOURNAL AND PATTERN RECOGNITION</w:t>
+        <w:t>11.4 ANALYTICAL TRADE JOURNAL AND PATTERN RECOGNITION</w:t>
       </w:r>
     </w:p>
     <w:p>
@@ -38013,17 +37743,7 @@
           <w:szCs w:val="24"/>
           <w:lang w:val="en-IN"/>
         </w:rPr>
-        <w:t xml:space="preserve">11.5 </w:t>
-      </w:r>
-      <w:r>
-        <w:rPr>
-          <w:b/>
-          <w:bCs/>
-          <w:sz w:val="24"/>
-          <w:szCs w:val="24"/>
-          <w:lang w:val="en-IN"/>
-        </w:rPr>
-        <w:t>ENTERPRISE CONTAINERIZATION</w:t>
+        <w:t>11.5 ENTERPRISE CONTAINERIZATION</w:t>
       </w:r>
     </w:p>
     <w:p>
@@ -39345,17 +39065,7 @@
           <w:lang w:val="en-IN"/>
         </w:rPr>
         <w:lastRenderedPageBreak/>
-        <w:t xml:space="preserve">13.1 </w:t>
-      </w:r>
-      <w:r>
-        <w:rPr>
-          <w:b/>
-          <w:bCs/>
-          <w:sz w:val="24"/>
-          <w:szCs w:val="24"/>
-          <w:lang w:val="en-IN"/>
-        </w:rPr>
-        <w:t>REFERENCES</w:t>
+        <w:t>13.1 REFERENCES</w:t>
       </w:r>
     </w:p>
     <w:p>
@@ -39454,7 +39164,29 @@
           <w:szCs w:val="24"/>
           <w:lang w:val="en-IN"/>
         </w:rPr>
-        <w:t xml:space="preserve"> [2] </w:t>
+        <w:t xml:space="preserve"> </w:t>
+      </w:r>
+    </w:p>
+    <w:p>
+      <w:pPr>
+        <w:tabs>
+          <w:tab w:val="left" w:pos="1333"/>
+        </w:tabs>
+        <w:spacing w:before="240" w:line="360" w:lineRule="auto"/>
+        <w:jc w:val="both"/>
+        <w:rPr>
+          <w:sz w:val="24"/>
+          <w:szCs w:val="24"/>
+          <w:lang w:val="en-IN"/>
+        </w:rPr>
+      </w:pPr>
+      <w:r>
+        <w:rPr>
+          <w:sz w:val="24"/>
+          <w:szCs w:val="24"/>
+          <w:lang w:val="en-IN"/>
+        </w:rPr>
+        <w:t xml:space="preserve">[2] </w:t>
       </w:r>
       <w:proofErr w:type="spellStart"/>
       <w:r>
@@ -39527,7 +39259,29 @@
           <w:szCs w:val="24"/>
           <w:lang w:val="en-IN"/>
         </w:rPr>
-        <w:t xml:space="preserve"> [3] </w:t>
+        <w:t xml:space="preserve"> </w:t>
+      </w:r>
+    </w:p>
+    <w:p>
+      <w:pPr>
+        <w:tabs>
+          <w:tab w:val="left" w:pos="1333"/>
+        </w:tabs>
+        <w:spacing w:before="240" w:line="360" w:lineRule="auto"/>
+        <w:jc w:val="both"/>
+        <w:rPr>
+          <w:sz w:val="24"/>
+          <w:szCs w:val="24"/>
+          <w:lang w:val="en-IN"/>
+        </w:rPr>
+      </w:pPr>
+      <w:r>
+        <w:rPr>
+          <w:sz w:val="24"/>
+          <w:szCs w:val="24"/>
+          <w:lang w:val="en-IN"/>
+        </w:rPr>
+        <w:t xml:space="preserve">[3] </w:t>
       </w:r>
       <w:proofErr w:type="spellStart"/>
       <w:r>
@@ -39582,7 +39336,29 @@
           <w:szCs w:val="24"/>
           <w:lang w:val="en-IN"/>
         </w:rPr>
-        <w:t xml:space="preserve"> [4] </w:t>
+        <w:t xml:space="preserve"> </w:t>
+      </w:r>
+    </w:p>
+    <w:p>
+      <w:pPr>
+        <w:tabs>
+          <w:tab w:val="left" w:pos="1333"/>
+        </w:tabs>
+        <w:spacing w:before="240" w:line="360" w:lineRule="auto"/>
+        <w:jc w:val="both"/>
+        <w:rPr>
+          <w:sz w:val="24"/>
+          <w:szCs w:val="24"/>
+          <w:lang w:val="en-IN"/>
+        </w:rPr>
+      </w:pPr>
+      <w:r>
+        <w:rPr>
+          <w:sz w:val="24"/>
+          <w:szCs w:val="24"/>
+          <w:lang w:val="en-IN"/>
+        </w:rPr>
+        <w:t xml:space="preserve">[4] </w:t>
       </w:r>
       <w:proofErr w:type="spellStart"/>
       <w:r>
@@ -39649,7 +39425,29 @@
           <w:szCs w:val="24"/>
           <w:lang w:val="en-IN"/>
         </w:rPr>
-        <w:t xml:space="preserve"> [5] Meta Platforms, Inc., "React: The library for web and native user interfaces," </w:t>
+        <w:t xml:space="preserve"> </w:t>
+      </w:r>
+    </w:p>
+    <w:p>
+      <w:pPr>
+        <w:tabs>
+          <w:tab w:val="left" w:pos="1333"/>
+        </w:tabs>
+        <w:spacing w:before="240" w:line="360" w:lineRule="auto"/>
+        <w:jc w:val="both"/>
+        <w:rPr>
+          <w:sz w:val="24"/>
+          <w:szCs w:val="24"/>
+          <w:lang w:val="en-IN"/>
+        </w:rPr>
+      </w:pPr>
+      <w:r>
+        <w:rPr>
+          <w:sz w:val="24"/>
+          <w:szCs w:val="24"/>
+          <w:lang w:val="en-IN"/>
+        </w:rPr>
+        <w:t xml:space="preserve">[5] Meta Platforms, Inc., "React: The library for web and native user interfaces," </w:t>
       </w:r>
       <w:r>
         <w:rPr>
@@ -39686,7 +39484,29 @@
           <w:szCs w:val="24"/>
           <w:lang w:val="en-IN"/>
         </w:rPr>
-        <w:t xml:space="preserve"> [6] </w:t>
+        <w:t xml:space="preserve"> </w:t>
+      </w:r>
+    </w:p>
+    <w:p>
+      <w:pPr>
+        <w:tabs>
+          <w:tab w:val="left" w:pos="1333"/>
+        </w:tabs>
+        <w:spacing w:before="240" w:line="360" w:lineRule="auto"/>
+        <w:jc w:val="both"/>
+        <w:rPr>
+          <w:sz w:val="24"/>
+          <w:szCs w:val="24"/>
+          <w:lang w:val="en-IN"/>
+        </w:rPr>
+      </w:pPr>
+      <w:r>
+        <w:rPr>
+          <w:sz w:val="24"/>
+          <w:szCs w:val="24"/>
+          <w:lang w:val="en-IN"/>
+        </w:rPr>
+        <w:t xml:space="preserve">[6] </w:t>
       </w:r>
       <w:proofErr w:type="spellStart"/>
       <w:r>
@@ -39759,7 +39579,29 @@
           <w:szCs w:val="24"/>
           <w:lang w:val="en-IN"/>
         </w:rPr>
-        <w:t xml:space="preserve"> [7] T. Hougaard, </w:t>
+        <w:t xml:space="preserve"> </w:t>
+      </w:r>
+    </w:p>
+    <w:p>
+      <w:pPr>
+        <w:tabs>
+          <w:tab w:val="left" w:pos="1333"/>
+        </w:tabs>
+        <w:spacing w:before="240" w:line="360" w:lineRule="auto"/>
+        <w:jc w:val="both"/>
+        <w:rPr>
+          <w:sz w:val="24"/>
+          <w:szCs w:val="24"/>
+          <w:lang w:val="en-IN"/>
+        </w:rPr>
+      </w:pPr>
+      <w:r>
+        <w:rPr>
+          <w:sz w:val="24"/>
+          <w:szCs w:val="24"/>
+          <w:lang w:val="en-IN"/>
+        </w:rPr>
+        <w:t xml:space="preserve">[7] T. Hougaard, </w:t>
       </w:r>
       <w:r>
         <w:rPr>
@@ -39817,7 +39659,29 @@
           <w:szCs w:val="24"/>
           <w:lang w:val="en-IN"/>
         </w:rPr>
-        <w:t xml:space="preserve">. [8] M. Douglas, </w:t>
+        <w:t xml:space="preserve">. </w:t>
+      </w:r>
+    </w:p>
+    <w:p>
+      <w:pPr>
+        <w:tabs>
+          <w:tab w:val="left" w:pos="1333"/>
+        </w:tabs>
+        <w:spacing w:before="240" w:line="360" w:lineRule="auto"/>
+        <w:jc w:val="both"/>
+        <w:rPr>
+          <w:sz w:val="24"/>
+          <w:szCs w:val="24"/>
+          <w:lang w:val="en-IN"/>
+        </w:rPr>
+      </w:pPr>
+      <w:r>
+        <w:rPr>
+          <w:sz w:val="24"/>
+          <w:szCs w:val="24"/>
+          <w:lang w:val="en-IN"/>
+        </w:rPr>
+        <w:t xml:space="preserve">[8] M. Douglas, </w:t>
       </w:r>
       <w:r>
         <w:rPr>
@@ -39871,26 +39735,6 @@
           <w:lang w:val="en-IN"/>
         </w:rPr>
       </w:pPr>
-      <w:r>
-        <w:rPr>
-          <w:b/>
-          <w:bCs/>
-          <w:sz w:val="24"/>
-          <w:szCs w:val="24"/>
-          <w:lang w:val="en-IN"/>
-        </w:rPr>
-        <w:t xml:space="preserve">13.2 </w:t>
-      </w:r>
-      <w:r>
-        <w:rPr>
-          <w:b/>
-          <w:bCs/>
-          <w:sz w:val="24"/>
-          <w:szCs w:val="24"/>
-          <w:lang w:val="en-IN"/>
-        </w:rPr>
-        <w:t>SYSTEM SCREENSHOTS</w:t>
-      </w:r>
     </w:p>
     <w:p>
       <w:pPr>
@@ -39900,6 +39744,101 @@
         <w:spacing w:before="240" w:line="360" w:lineRule="auto"/>
         <w:jc w:val="both"/>
         <w:rPr>
+          <w:b/>
+          <w:bCs/>
+          <w:sz w:val="24"/>
+          <w:szCs w:val="24"/>
+          <w:lang w:val="en-IN"/>
+        </w:rPr>
+      </w:pPr>
+    </w:p>
+    <w:p>
+      <w:pPr>
+        <w:tabs>
+          <w:tab w:val="left" w:pos="1333"/>
+        </w:tabs>
+        <w:spacing w:before="240" w:line="360" w:lineRule="auto"/>
+        <w:jc w:val="both"/>
+        <w:rPr>
+          <w:b/>
+          <w:bCs/>
+          <w:sz w:val="24"/>
+          <w:szCs w:val="24"/>
+          <w:lang w:val="en-IN"/>
+        </w:rPr>
+      </w:pPr>
+    </w:p>
+    <w:p>
+      <w:pPr>
+        <w:tabs>
+          <w:tab w:val="left" w:pos="1333"/>
+        </w:tabs>
+        <w:spacing w:before="240" w:line="360" w:lineRule="auto"/>
+        <w:jc w:val="both"/>
+        <w:rPr>
+          <w:b/>
+          <w:bCs/>
+          <w:sz w:val="24"/>
+          <w:szCs w:val="24"/>
+          <w:lang w:val="en-IN"/>
+        </w:rPr>
+      </w:pPr>
+      <w:r>
+        <w:rPr>
+          <w:b/>
+          <w:bCs/>
+          <w:sz w:val="24"/>
+          <w:szCs w:val="24"/>
+          <w:lang w:val="en-IN"/>
+        </w:rPr>
+        <w:lastRenderedPageBreak/>
+        <w:t>13.2 SYSTEM SCREENSHOTS</w:t>
+      </w:r>
+    </w:p>
+    <w:p>
+      <w:pPr>
+        <w:tabs>
+          <w:tab w:val="left" w:pos="1333"/>
+        </w:tabs>
+        <w:spacing w:before="240" w:line="360" w:lineRule="auto"/>
+        <w:jc w:val="both"/>
+        <w:rPr>
+          <w:sz w:val="24"/>
+          <w:szCs w:val="24"/>
+          <w:lang w:val="en-IN"/>
+        </w:rPr>
+      </w:pPr>
+      <w:r>
+        <w:rPr>
+          <w:b/>
+          <w:bCs/>
+          <w:sz w:val="24"/>
+          <w:szCs w:val="24"/>
+          <w:lang w:val="en-IN"/>
+        </w:rPr>
+        <w:t xml:space="preserve">Figure 13.2.1: </w:t>
+      </w:r>
+      <w:r>
+        <w:rPr>
+          <w:b/>
+          <w:bCs/>
+          <w:sz w:val="24"/>
+          <w:szCs w:val="24"/>
+          <w:lang w:val="en-IN"/>
+        </w:rPr>
+        <w:t xml:space="preserve">USER AUTHENTICATION </w:t>
+      </w:r>
+    </w:p>
+    <w:p>
+      <w:pPr>
+        <w:tabs>
+          <w:tab w:val="left" w:pos="1333"/>
+        </w:tabs>
+        <w:spacing w:before="240" w:line="360" w:lineRule="auto"/>
+        <w:jc w:val="both"/>
+        <w:rPr>
+          <w:b/>
+          <w:bCs/>
           <w:sz w:val="24"/>
           <w:szCs w:val="24"/>
           <w:lang w:val="en-IN"/>
@@ -39913,7 +39852,41 @@
           <w:szCs w:val="24"/>
           <w:lang w:val="en-IN"/>
         </w:rPr>
-        <w:t>(Note to student: Insert your actual application screenshots directly beneath each of these designated figure headers in your final Word document.)</w:t>
+        <w:drawing>
+          <wp:inline distT="0" distB="0" distL="0" distR="0" wp14:anchorId="473F2634" wp14:editId="771F87E7">
+            <wp:extent cx="5706110" cy="2887345"/>
+            <wp:effectExtent l="0" t="0" r="8890" b="8255"/>
+            <wp:docPr id="1261182713" name="Picture 1"/>
+            <wp:cNvGraphicFramePr>
+              <a:graphicFrameLocks xmlns:a="http://schemas.openxmlformats.org/drawingml/2006/main" noChangeAspect="1"/>
+            </wp:cNvGraphicFramePr>
+            <a:graphic xmlns:a="http://schemas.openxmlformats.org/drawingml/2006/main">
+              <a:graphicData uri="http://schemas.openxmlformats.org/drawingml/2006/picture">
+                <pic:pic xmlns:pic="http://schemas.openxmlformats.org/drawingml/2006/picture">
+                  <pic:nvPicPr>
+                    <pic:cNvPr id="1261182713" name=""/>
+                    <pic:cNvPicPr/>
+                  </pic:nvPicPr>
+                  <pic:blipFill>
+                    <a:blip r:embed="rId31"/>
+                    <a:stretch>
+                      <a:fillRect/>
+                    </a:stretch>
+                  </pic:blipFill>
+                  <pic:spPr>
+                    <a:xfrm>
+                      <a:off x="0" y="0"/>
+                      <a:ext cx="5706110" cy="2887345"/>
+                    </a:xfrm>
+                    <a:prstGeom prst="rect">
+                      <a:avLst/>
+                    </a:prstGeom>
+                  </pic:spPr>
+                </pic:pic>
+              </a:graphicData>
+            </a:graphic>
+          </wp:inline>
+        </w:drawing>
       </w:r>
     </w:p>
     <w:p>
@@ -39937,17 +39910,17 @@
           <w:szCs w:val="24"/>
           <w:lang w:val="en-IN"/>
         </w:rPr>
-        <w:t xml:space="preserve">Figure 13.2.1: </w:t>
-      </w:r>
-      <w:r>
-        <w:rPr>
-          <w:b/>
-          <w:bCs/>
-          <w:sz w:val="24"/>
-          <w:szCs w:val="24"/>
-          <w:lang w:val="en-IN"/>
-        </w:rPr>
-        <w:t>USER AUTHENTICATION &amp; JWT SECURITY</w:t>
+        <w:t xml:space="preserve">Figure 13.2.2: </w:t>
+      </w:r>
+      <w:r>
+        <w:rPr>
+          <w:b/>
+          <w:bCs/>
+          <w:sz w:val="24"/>
+          <w:szCs w:val="24"/>
+          <w:lang w:val="en-IN"/>
+        </w:rPr>
+        <w:t>HISTORICAL REPLAY ENGINE &amp; MULTI-TIMEFRAME CANVAS</w:t>
       </w:r>
       <w:r>
         <w:rPr>
@@ -39979,9 +39952,133 @@
           <w:szCs w:val="24"/>
           <w:lang w:val="en-IN"/>
         </w:rPr>
-        <w:t xml:space="preserve">(Insert a screenshot of the React Login/Registration screen. Consider opening the Chrome </w:t>
-      </w:r>
-      <w:proofErr w:type="spellStart"/>
+        <w:drawing>
+          <wp:inline distT="0" distB="0" distL="0" distR="0" wp14:anchorId="4FB3ED4C" wp14:editId="2122DE0E">
+            <wp:extent cx="5706110" cy="2914650"/>
+            <wp:effectExtent l="0" t="0" r="8890" b="0"/>
+            <wp:docPr id="1014440231" name="Picture 1"/>
+            <wp:cNvGraphicFramePr>
+              <a:graphicFrameLocks xmlns:a="http://schemas.openxmlformats.org/drawingml/2006/main" noChangeAspect="1"/>
+            </wp:cNvGraphicFramePr>
+            <a:graphic xmlns:a="http://schemas.openxmlformats.org/drawingml/2006/main">
+              <a:graphicData uri="http://schemas.openxmlformats.org/drawingml/2006/picture">
+                <pic:pic xmlns:pic="http://schemas.openxmlformats.org/drawingml/2006/picture">
+                  <pic:nvPicPr>
+                    <pic:cNvPr id="1014440231" name=""/>
+                    <pic:cNvPicPr/>
+                  </pic:nvPicPr>
+                  <pic:blipFill>
+                    <a:blip r:embed="rId32"/>
+                    <a:stretch>
+                      <a:fillRect/>
+                    </a:stretch>
+                  </pic:blipFill>
+                  <pic:spPr>
+                    <a:xfrm>
+                      <a:off x="0" y="0"/>
+                      <a:ext cx="5706110" cy="2914650"/>
+                    </a:xfrm>
+                    <a:prstGeom prst="rect">
+                      <a:avLst/>
+                    </a:prstGeom>
+                  </pic:spPr>
+                </pic:pic>
+              </a:graphicData>
+            </a:graphic>
+          </wp:inline>
+        </w:drawing>
+      </w:r>
+    </w:p>
+    <w:p>
+      <w:pPr>
+        <w:tabs>
+          <w:tab w:val="left" w:pos="1333"/>
+        </w:tabs>
+        <w:spacing w:before="240" w:line="360" w:lineRule="auto"/>
+        <w:jc w:val="both"/>
+        <w:rPr>
+          <w:b/>
+          <w:bCs/>
+          <w:sz w:val="24"/>
+          <w:szCs w:val="24"/>
+          <w:lang w:val="en-IN"/>
+        </w:rPr>
+      </w:pPr>
+    </w:p>
+    <w:p>
+      <w:pPr>
+        <w:tabs>
+          <w:tab w:val="left" w:pos="1333"/>
+        </w:tabs>
+        <w:spacing w:before="240" w:line="360" w:lineRule="auto"/>
+        <w:jc w:val="both"/>
+        <w:rPr>
+          <w:b/>
+          <w:bCs/>
+          <w:sz w:val="24"/>
+          <w:szCs w:val="24"/>
+          <w:lang w:val="en-IN"/>
+        </w:rPr>
+      </w:pPr>
+    </w:p>
+    <w:p>
+      <w:pPr>
+        <w:tabs>
+          <w:tab w:val="left" w:pos="1333"/>
+        </w:tabs>
+        <w:spacing w:before="240" w:line="360" w:lineRule="auto"/>
+        <w:jc w:val="both"/>
+        <w:rPr>
+          <w:sz w:val="24"/>
+          <w:szCs w:val="24"/>
+          <w:lang w:val="en-IN"/>
+        </w:rPr>
+      </w:pPr>
+      <w:r>
+        <w:rPr>
+          <w:b/>
+          <w:bCs/>
+          <w:sz w:val="24"/>
+          <w:szCs w:val="24"/>
+          <w:lang w:val="en-IN"/>
+        </w:rPr>
+        <w:lastRenderedPageBreak/>
+        <w:t xml:space="preserve">Figure 13.2.3: </w:t>
+      </w:r>
+      <w:r>
+        <w:rPr>
+          <w:b/>
+          <w:bCs/>
+          <w:sz w:val="24"/>
+          <w:szCs w:val="24"/>
+          <w:lang w:val="en-IN"/>
+        </w:rPr>
+        <w:t>ORDER EXECUTION &amp; VISUAL SL/TP LINES</w:t>
+      </w:r>
+      <w:r>
+        <w:rPr>
+          <w:sz w:val="24"/>
+          <w:szCs w:val="24"/>
+          <w:lang w:val="en-IN"/>
+        </w:rPr>
+        <w:t xml:space="preserve"> </w:t>
+      </w:r>
+    </w:p>
+    <w:p>
+      <w:pPr>
+        <w:tabs>
+          <w:tab w:val="left" w:pos="1333"/>
+        </w:tabs>
+        <w:spacing w:before="240" w:line="360" w:lineRule="auto"/>
+        <w:jc w:val="both"/>
+        <w:rPr>
+          <w:b/>
+          <w:bCs/>
+          <w:sz w:val="24"/>
+          <w:szCs w:val="24"/>
+          <w:lang w:val="en-IN"/>
+        </w:rPr>
+      </w:pPr>
       <w:r>
         <w:rPr>
           <w:i/>
@@ -39990,9 +40087,109 @@
           <w:szCs w:val="24"/>
           <w:lang w:val="en-IN"/>
         </w:rPr>
-        <w:t>DevTools</w:t>
-      </w:r>
-      <w:proofErr w:type="spellEnd"/>
+        <w:drawing>
+          <wp:inline distT="0" distB="0" distL="0" distR="0" wp14:anchorId="3D96FC33" wp14:editId="0CD207CE">
+            <wp:extent cx="5706110" cy="2895376"/>
+            <wp:effectExtent l="0" t="0" r="0" b="635"/>
+            <wp:docPr id="1222165260" name="Picture 1"/>
+            <wp:cNvGraphicFramePr>
+              <a:graphicFrameLocks xmlns:a="http://schemas.openxmlformats.org/drawingml/2006/main" noChangeAspect="1"/>
+            </wp:cNvGraphicFramePr>
+            <a:graphic xmlns:a="http://schemas.openxmlformats.org/drawingml/2006/main">
+              <a:graphicData uri="http://schemas.openxmlformats.org/drawingml/2006/picture">
+                <pic:pic xmlns:pic="http://schemas.openxmlformats.org/drawingml/2006/picture">
+                  <pic:nvPicPr>
+                    <pic:cNvPr id="1222165260" name=""/>
+                    <pic:cNvPicPr/>
+                  </pic:nvPicPr>
+                  <pic:blipFill rotWithShape="1">
+                    <a:blip r:embed="rId33"/>
+                    <a:srcRect t="920"/>
+                    <a:stretch>
+                      <a:fillRect/>
+                    </a:stretch>
+                  </pic:blipFill>
+                  <pic:spPr bwMode="auto">
+                    <a:xfrm>
+                      <a:off x="0" y="0"/>
+                      <a:ext cx="5706110" cy="2895376"/>
+                    </a:xfrm>
+                    <a:prstGeom prst="rect">
+                      <a:avLst/>
+                    </a:prstGeom>
+                    <a:ln>
+                      <a:noFill/>
+                    </a:ln>
+                    <a:extLst>
+                      <a:ext uri="{53640926-AAD7-44D8-BBD7-CCE9431645EC}">
+                        <a14:shadowObscured xmlns:a14="http://schemas.microsoft.com/office/drawing/2010/main"/>
+                      </a:ext>
+                    </a:extLst>
+                  </pic:spPr>
+                </pic:pic>
+              </a:graphicData>
+            </a:graphic>
+          </wp:inline>
+        </w:drawing>
+      </w:r>
+    </w:p>
+    <w:p>
+      <w:pPr>
+        <w:tabs>
+          <w:tab w:val="left" w:pos="1333"/>
+        </w:tabs>
+        <w:spacing w:before="240" w:line="360" w:lineRule="auto"/>
+        <w:jc w:val="both"/>
+        <w:rPr>
+          <w:sz w:val="24"/>
+          <w:szCs w:val="24"/>
+          <w:lang w:val="en-IN"/>
+        </w:rPr>
+      </w:pPr>
+      <w:r>
+        <w:rPr>
+          <w:b/>
+          <w:bCs/>
+          <w:sz w:val="24"/>
+          <w:szCs w:val="24"/>
+          <w:lang w:val="en-IN"/>
+        </w:rPr>
+        <w:t xml:space="preserve">Figure 13.2.4: </w:t>
+      </w:r>
+      <w:r>
+        <w:rPr>
+          <w:b/>
+          <w:bCs/>
+          <w:sz w:val="24"/>
+          <w:szCs w:val="24"/>
+          <w:lang w:val="en-IN"/>
+        </w:rPr>
+        <w:t>REAL-TIME MT5 LIVE PRICE BRIDGE</w:t>
+      </w:r>
+      <w:r>
+        <w:rPr>
+          <w:sz w:val="24"/>
+          <w:szCs w:val="24"/>
+          <w:lang w:val="en-IN"/>
+        </w:rPr>
+        <w:t xml:space="preserve"> </w:t>
+      </w:r>
+    </w:p>
+    <w:p>
+      <w:pPr>
+        <w:tabs>
+          <w:tab w:val="left" w:pos="1333"/>
+        </w:tabs>
+        <w:spacing w:before="240" w:line="360" w:lineRule="auto"/>
+        <w:jc w:val="both"/>
+        <w:rPr>
+          <w:b/>
+          <w:bCs/>
+          <w:sz w:val="24"/>
+          <w:szCs w:val="24"/>
+          <w:lang w:val="en-IN"/>
+        </w:rPr>
+      </w:pPr>
       <w:r>
         <w:rPr>
           <w:i/>
@@ -40001,9 +40198,145 @@
           <w:szCs w:val="24"/>
           <w:lang w:val="en-IN"/>
         </w:rPr>
-        <w:t xml:space="preserve"> 'Network' or 'Application' tab in the screenshot to visually demonstrate the JWT Bearer Token stored in </w:t>
-      </w:r>
-      <w:proofErr w:type="spellStart"/>
+        <w:drawing>
+          <wp:inline distT="0" distB="0" distL="0" distR="0" wp14:anchorId="74FEFB5A" wp14:editId="438D4F05">
+            <wp:extent cx="5706110" cy="2881630"/>
+            <wp:effectExtent l="0" t="0" r="8890" b="0"/>
+            <wp:docPr id="325551832" name="Picture 1"/>
+            <wp:cNvGraphicFramePr>
+              <a:graphicFrameLocks xmlns:a="http://schemas.openxmlformats.org/drawingml/2006/main" noChangeAspect="1"/>
+            </wp:cNvGraphicFramePr>
+            <a:graphic xmlns:a="http://schemas.openxmlformats.org/drawingml/2006/main">
+              <a:graphicData uri="http://schemas.openxmlformats.org/drawingml/2006/picture">
+                <pic:pic xmlns:pic="http://schemas.openxmlformats.org/drawingml/2006/picture">
+                  <pic:nvPicPr>
+                    <pic:cNvPr id="325551832" name=""/>
+                    <pic:cNvPicPr/>
+                  </pic:nvPicPr>
+                  <pic:blipFill>
+                    <a:blip r:embed="rId34"/>
+                    <a:stretch>
+                      <a:fillRect/>
+                    </a:stretch>
+                  </pic:blipFill>
+                  <pic:spPr>
+                    <a:xfrm>
+                      <a:off x="0" y="0"/>
+                      <a:ext cx="5706110" cy="2881630"/>
+                    </a:xfrm>
+                    <a:prstGeom prst="rect">
+                      <a:avLst/>
+                    </a:prstGeom>
+                  </pic:spPr>
+                </pic:pic>
+              </a:graphicData>
+            </a:graphic>
+          </wp:inline>
+        </w:drawing>
+      </w:r>
+    </w:p>
+    <w:p>
+      <w:pPr>
+        <w:tabs>
+          <w:tab w:val="left" w:pos="1333"/>
+        </w:tabs>
+        <w:spacing w:before="240" w:line="360" w:lineRule="auto"/>
+        <w:jc w:val="both"/>
+        <w:rPr>
+          <w:b/>
+          <w:bCs/>
+          <w:sz w:val="24"/>
+          <w:szCs w:val="24"/>
+          <w:lang w:val="en-IN"/>
+        </w:rPr>
+      </w:pPr>
+    </w:p>
+    <w:p>
+      <w:pPr>
+        <w:tabs>
+          <w:tab w:val="left" w:pos="1333"/>
+        </w:tabs>
+        <w:spacing w:before="240" w:line="360" w:lineRule="auto"/>
+        <w:jc w:val="both"/>
+        <w:rPr>
+          <w:b/>
+          <w:bCs/>
+          <w:sz w:val="24"/>
+          <w:szCs w:val="24"/>
+          <w:lang w:val="en-IN"/>
+        </w:rPr>
+      </w:pPr>
+    </w:p>
+    <w:p>
+      <w:pPr>
+        <w:tabs>
+          <w:tab w:val="left" w:pos="1333"/>
+        </w:tabs>
+        <w:spacing w:before="240" w:line="360" w:lineRule="auto"/>
+        <w:jc w:val="both"/>
+        <w:rPr>
+          <w:b/>
+          <w:bCs/>
+          <w:sz w:val="24"/>
+          <w:szCs w:val="24"/>
+          <w:lang w:val="en-IN"/>
+        </w:rPr>
+      </w:pPr>
+    </w:p>
+    <w:p>
+      <w:pPr>
+        <w:tabs>
+          <w:tab w:val="left" w:pos="1333"/>
+        </w:tabs>
+        <w:spacing w:before="240" w:line="360" w:lineRule="auto"/>
+        <w:jc w:val="both"/>
+        <w:rPr>
+          <w:sz w:val="24"/>
+          <w:szCs w:val="24"/>
+          <w:lang w:val="en-IN"/>
+        </w:rPr>
+      </w:pPr>
+      <w:r>
+        <w:rPr>
+          <w:b/>
+          <w:bCs/>
+          <w:sz w:val="24"/>
+          <w:szCs w:val="24"/>
+          <w:lang w:val="en-IN"/>
+        </w:rPr>
+        <w:lastRenderedPageBreak/>
+        <w:t xml:space="preserve">Figure 13.2.5: </w:t>
+      </w:r>
+      <w:r>
+        <w:rPr>
+          <w:b/>
+          <w:bCs/>
+          <w:sz w:val="24"/>
+          <w:szCs w:val="24"/>
+          <w:lang w:val="en-IN"/>
+        </w:rPr>
+        <w:t>QUANTITATIVE ANALYTICS DASHBOARD</w:t>
+      </w:r>
+      <w:r>
+        <w:rPr>
+          <w:sz w:val="24"/>
+          <w:szCs w:val="24"/>
+          <w:lang w:val="en-IN"/>
+        </w:rPr>
+        <w:t xml:space="preserve"> </w:t>
+      </w:r>
+    </w:p>
+    <w:p>
+      <w:pPr>
+        <w:tabs>
+          <w:tab w:val="left" w:pos="1333"/>
+        </w:tabs>
+        <w:rPr>
+          <w:sz w:val="28"/>
+          <w:szCs w:val="28"/>
+          <w:lang w:val="en-IN"/>
+        </w:rPr>
+      </w:pPr>
       <w:r>
         <w:rPr>
           <w:i/>
@@ -40012,385 +40345,54 @@
           <w:szCs w:val="24"/>
           <w:lang w:val="en-IN"/>
         </w:rPr>
-        <w:t>localStorage</w:t>
-      </w:r>
-      <w:proofErr w:type="spellEnd"/>
-      <w:r>
-        <w:rPr>
-          <w:i/>
-          <w:iCs/>
-          <w:sz w:val="24"/>
-          <w:szCs w:val="24"/>
-          <w:lang w:val="en-IN"/>
-        </w:rPr>
-        <w:t xml:space="preserve"> or the </w:t>
-      </w:r>
-      <w:proofErr w:type="spellStart"/>
-      <w:r>
-        <w:rPr>
-          <w:i/>
-          <w:iCs/>
-          <w:sz w:val="24"/>
-          <w:szCs w:val="24"/>
-          <w:lang w:val="en-IN"/>
-        </w:rPr>
-        <w:t>BCrypt</w:t>
-      </w:r>
-      <w:proofErr w:type="spellEnd"/>
-      <w:r>
-        <w:rPr>
-          <w:i/>
-          <w:iCs/>
-          <w:sz w:val="24"/>
-          <w:szCs w:val="24"/>
-          <w:lang w:val="en-IN"/>
-        </w:rPr>
-        <w:t xml:space="preserve"> payload being sent to the API.)</w:t>
-      </w:r>
-    </w:p>
-    <w:p>
-      <w:pPr>
-        <w:tabs>
-          <w:tab w:val="left" w:pos="1333"/>
-        </w:tabs>
-        <w:spacing w:before="240" w:line="360" w:lineRule="auto"/>
-        <w:jc w:val="both"/>
-        <w:rPr>
-          <w:sz w:val="24"/>
-          <w:szCs w:val="24"/>
-          <w:lang w:val="en-IN"/>
-        </w:rPr>
-      </w:pPr>
-      <w:r>
-        <w:rPr>
-          <w:b/>
-          <w:bCs/>
-          <w:sz w:val="24"/>
-          <w:szCs w:val="24"/>
-          <w:lang w:val="en-IN"/>
-        </w:rPr>
-        <w:t xml:space="preserve">Figure 13.2.2: </w:t>
-      </w:r>
-      <w:r>
-        <w:rPr>
-          <w:b/>
-          <w:bCs/>
-          <w:sz w:val="24"/>
-          <w:szCs w:val="24"/>
-          <w:lang w:val="en-IN"/>
-        </w:rPr>
-        <w:t>HISTORICAL REPLAY ENGINE &amp; MULTI-TIMEFRAME CANVAS</w:t>
-      </w:r>
-      <w:r>
-        <w:rPr>
-          <w:sz w:val="24"/>
-          <w:szCs w:val="24"/>
-          <w:lang w:val="en-IN"/>
-        </w:rPr>
-        <w:t xml:space="preserve"> </w:t>
-      </w:r>
-      <w:r>
-        <w:rPr>
-          <w:i/>
-          <w:iCs/>
-          <w:sz w:val="24"/>
-          <w:szCs w:val="24"/>
-          <w:lang w:val="en-IN"/>
-        </w:rPr>
-        <w:lastRenderedPageBreak/>
-        <w:t xml:space="preserve">(Insert a screenshot of the /replay route. The screenshot should clearly display the </w:t>
-      </w:r>
-      <w:proofErr w:type="spellStart"/>
-      <w:r>
-        <w:rPr>
-          <w:i/>
-          <w:iCs/>
-          <w:sz w:val="24"/>
-          <w:szCs w:val="24"/>
-          <w:lang w:val="en-IN"/>
-        </w:rPr>
-        <w:t>TradingView</w:t>
-      </w:r>
-      <w:proofErr w:type="spellEnd"/>
-      <w:r>
-        <w:rPr>
-          <w:i/>
-          <w:iCs/>
-          <w:sz w:val="24"/>
-          <w:szCs w:val="24"/>
-          <w:lang w:val="en-IN"/>
-        </w:rPr>
-        <w:t xml:space="preserve"> Lightweight Charts v5 canvas, showing historical candlesticks, the volume histogram, and the active timeframe selector (e.g., 15m or 1H) proving the server-side MTF aggregation is functioning.)</w:t>
-      </w:r>
-    </w:p>
-    <w:p>
-      <w:pPr>
-        <w:tabs>
-          <w:tab w:val="left" w:pos="1333"/>
-        </w:tabs>
-        <w:spacing w:before="240" w:line="360" w:lineRule="auto"/>
-        <w:jc w:val="both"/>
-        <w:rPr>
-          <w:sz w:val="24"/>
-          <w:szCs w:val="24"/>
-          <w:lang w:val="en-IN"/>
-        </w:rPr>
-      </w:pPr>
-      <w:r>
-        <w:rPr>
-          <w:b/>
-          <w:bCs/>
-          <w:sz w:val="24"/>
-          <w:szCs w:val="24"/>
-          <w:lang w:val="en-IN"/>
-        </w:rPr>
-        <w:t xml:space="preserve">Figure 13.2.3: </w:t>
-      </w:r>
-      <w:r>
-        <w:rPr>
-          <w:b/>
-          <w:bCs/>
-          <w:sz w:val="24"/>
-          <w:szCs w:val="24"/>
-          <w:lang w:val="en-IN"/>
-        </w:rPr>
-        <w:t>ORDER EXECUTION &amp; VISUAL SL/TP LINES</w:t>
-      </w:r>
-      <w:r>
-        <w:rPr>
-          <w:sz w:val="24"/>
-          <w:szCs w:val="24"/>
-          <w:lang w:val="en-IN"/>
-        </w:rPr>
-        <w:t xml:space="preserve"> </w:t>
-      </w:r>
-    </w:p>
-    <w:p>
-      <w:pPr>
-        <w:tabs>
-          <w:tab w:val="left" w:pos="1333"/>
-        </w:tabs>
-        <w:spacing w:before="240" w:line="360" w:lineRule="auto"/>
-        <w:jc w:val="both"/>
-        <w:rPr>
-          <w:sz w:val="24"/>
-          <w:szCs w:val="24"/>
-          <w:lang w:val="en-IN"/>
-        </w:rPr>
-      </w:pPr>
-      <w:r>
-        <w:rPr>
-          <w:i/>
-          <w:iCs/>
-          <w:sz w:val="24"/>
-          <w:szCs w:val="24"/>
-          <w:lang w:val="en-IN"/>
-        </w:rPr>
-        <w:t>(Insert a screenshot showing an active simulated trade. Ensure the visual order markers for Entry, Stop Loss (SL), and Take Profit (TP) are distinctly visible on the chart canvas, demonstrating the interactive execution UI.)</w:t>
-      </w:r>
-    </w:p>
-    <w:p>
-      <w:pPr>
-        <w:tabs>
-          <w:tab w:val="left" w:pos="1333"/>
-        </w:tabs>
-        <w:spacing w:before="240" w:line="360" w:lineRule="auto"/>
-        <w:jc w:val="both"/>
-        <w:rPr>
-          <w:sz w:val="24"/>
-          <w:szCs w:val="24"/>
-          <w:lang w:val="en-IN"/>
-        </w:rPr>
-      </w:pPr>
-      <w:r>
-        <w:rPr>
-          <w:b/>
-          <w:bCs/>
-          <w:sz w:val="24"/>
-          <w:szCs w:val="24"/>
-          <w:lang w:val="en-IN"/>
-        </w:rPr>
-        <w:t xml:space="preserve">Figure 13.2.4: </w:t>
-      </w:r>
-      <w:r>
-        <w:rPr>
-          <w:b/>
-          <w:bCs/>
-          <w:sz w:val="24"/>
-          <w:szCs w:val="24"/>
-          <w:lang w:val="en-IN"/>
-        </w:rPr>
-        <w:t>REAL-TIME MT5 LIVE PRICE BRIDGE</w:t>
-      </w:r>
-      <w:r>
-        <w:rPr>
-          <w:sz w:val="24"/>
-          <w:szCs w:val="24"/>
-          <w:lang w:val="en-IN"/>
-        </w:rPr>
-        <w:t xml:space="preserve"> </w:t>
-      </w:r>
-    </w:p>
-    <w:p>
-      <w:pPr>
-        <w:tabs>
-          <w:tab w:val="left" w:pos="1333"/>
-        </w:tabs>
-        <w:spacing w:before="240" w:line="360" w:lineRule="auto"/>
-        <w:jc w:val="both"/>
-        <w:rPr>
-          <w:sz w:val="24"/>
-          <w:szCs w:val="24"/>
-          <w:lang w:val="en-IN"/>
-        </w:rPr>
-      </w:pPr>
-      <w:r>
-        <w:rPr>
-          <w:i/>
-          <w:iCs/>
-          <w:sz w:val="24"/>
-          <w:szCs w:val="24"/>
-          <w:lang w:val="en-IN"/>
-        </w:rPr>
-        <w:t>(Insert a split-screen screenshot. On the left, show the Python terminal outputting the 500-millisecond tick ingestion logs; on the right, show the React client at the /live route displaying the dynamically updating live price and floating unrealized P&amp;L.)</w:t>
-      </w:r>
-    </w:p>
-    <w:p>
-      <w:pPr>
-        <w:tabs>
-          <w:tab w:val="left" w:pos="1333"/>
-        </w:tabs>
-        <w:spacing w:before="240" w:line="360" w:lineRule="auto"/>
-        <w:jc w:val="both"/>
-        <w:rPr>
-          <w:sz w:val="24"/>
-          <w:szCs w:val="24"/>
-          <w:lang w:val="en-IN"/>
-        </w:rPr>
-      </w:pPr>
-      <w:r>
-        <w:rPr>
-          <w:b/>
-          <w:bCs/>
-          <w:sz w:val="24"/>
-          <w:szCs w:val="24"/>
-          <w:lang w:val="en-IN"/>
-        </w:rPr>
-        <w:t xml:space="preserve">Figure 13.2.5: </w:t>
-      </w:r>
-      <w:r>
-        <w:rPr>
-          <w:b/>
-          <w:bCs/>
-          <w:sz w:val="24"/>
-          <w:szCs w:val="24"/>
-          <w:lang w:val="en-IN"/>
-        </w:rPr>
-        <w:t>QUANTITATIVE ANALYTICS DASHBOARD</w:t>
-      </w:r>
-      <w:r>
-        <w:rPr>
-          <w:sz w:val="24"/>
-          <w:szCs w:val="24"/>
-          <w:lang w:val="en-IN"/>
-        </w:rPr>
-        <w:t xml:space="preserve"> </w:t>
-      </w:r>
-    </w:p>
-    <w:p>
-      <w:pPr>
-        <w:tabs>
-          <w:tab w:val="left" w:pos="1333"/>
-        </w:tabs>
-        <w:spacing w:before="240" w:line="360" w:lineRule="auto"/>
-        <w:jc w:val="both"/>
-        <w:rPr>
-          <w:sz w:val="24"/>
-          <w:szCs w:val="24"/>
-          <w:lang w:val="en-IN"/>
-        </w:rPr>
-      </w:pPr>
-      <w:r>
-        <w:rPr>
-          <w:i/>
-          <w:iCs/>
-          <w:sz w:val="24"/>
-          <w:szCs w:val="24"/>
-          <w:lang w:val="en-IN"/>
-        </w:rPr>
-        <w:t>(Insert a screenshot of the /analytics</w:t>
-      </w:r>
-      <w:proofErr w:type="gramStart"/>
-      <w:r>
-        <w:rPr>
-          <w:i/>
-          <w:iCs/>
-          <w:sz w:val="24"/>
-          <w:szCs w:val="24"/>
-          <w:lang w:val="en-IN"/>
-        </w:rPr>
-        <w:t>/:</w:t>
-      </w:r>
-      <w:proofErr w:type="spellStart"/>
-      <w:r>
-        <w:rPr>
-          <w:i/>
-          <w:iCs/>
-          <w:sz w:val="24"/>
-          <w:szCs w:val="24"/>
-          <w:lang w:val="en-IN"/>
-        </w:rPr>
-        <w:t>sessionId</w:t>
-      </w:r>
-      <w:proofErr w:type="spellEnd"/>
-      <w:proofErr w:type="gramEnd"/>
-      <w:r>
-        <w:rPr>
-          <w:i/>
-          <w:iCs/>
-          <w:sz w:val="24"/>
-          <w:szCs w:val="24"/>
-          <w:lang w:val="en-IN"/>
-        </w:rPr>
-        <w:t xml:space="preserve"> dashboard. The image must capture the computed performance metrics generated by the </w:t>
-      </w:r>
-      <w:proofErr w:type="spellStart"/>
-      <w:r>
-        <w:rPr>
-          <w:i/>
-          <w:iCs/>
-          <w:sz w:val="24"/>
-          <w:szCs w:val="24"/>
-          <w:lang w:val="en-IN"/>
-        </w:rPr>
-        <w:t>AnalyticsService</w:t>
-      </w:r>
-      <w:proofErr w:type="spellEnd"/>
-      <w:r>
-        <w:rPr>
-          <w:i/>
-          <w:iCs/>
-          <w:sz w:val="24"/>
-          <w:szCs w:val="24"/>
-          <w:lang w:val="en-IN"/>
-        </w:rPr>
-        <w:t>, specifically highlighting the calculated Win Rate %, Profit Factor, Max Drawdown %, and the closed trades audit table.)</w:t>
-      </w:r>
-    </w:p>
-    <w:p>
-      <w:pPr>
-        <w:tabs>
-          <w:tab w:val="left" w:pos="1333"/>
-        </w:tabs>
-        <w:rPr>
-          <w:sz w:val="28"/>
-          <w:szCs w:val="28"/>
-          <w:lang w:val="en-IN"/>
-        </w:rPr>
-      </w:pPr>
+        <w:drawing>
+          <wp:inline distT="0" distB="0" distL="0" distR="0" wp14:anchorId="5993F0A8" wp14:editId="26076448">
+            <wp:extent cx="5706110" cy="2872591"/>
+            <wp:effectExtent l="0" t="0" r="0" b="4445"/>
+            <wp:docPr id="642390046" name="Picture 1"/>
+            <wp:cNvGraphicFramePr>
+              <a:graphicFrameLocks xmlns:a="http://schemas.openxmlformats.org/drawingml/2006/main" noChangeAspect="1"/>
+            </wp:cNvGraphicFramePr>
+            <a:graphic xmlns:a="http://schemas.openxmlformats.org/drawingml/2006/main">
+              <a:graphicData uri="http://schemas.openxmlformats.org/drawingml/2006/picture">
+                <pic:pic xmlns:pic="http://schemas.openxmlformats.org/drawingml/2006/picture">
+                  <pic:nvPicPr>
+                    <pic:cNvPr id="642390046" name=""/>
+                    <pic:cNvPicPr/>
+                  </pic:nvPicPr>
+                  <pic:blipFill rotWithShape="1">
+                    <a:blip r:embed="rId35"/>
+                    <a:srcRect t="620"/>
+                    <a:stretch>
+                      <a:fillRect/>
+                    </a:stretch>
+                  </pic:blipFill>
+                  <pic:spPr bwMode="auto">
+                    <a:xfrm>
+                      <a:off x="0" y="0"/>
+                      <a:ext cx="5706110" cy="2872591"/>
+                    </a:xfrm>
+                    <a:prstGeom prst="rect">
+                      <a:avLst/>
+                    </a:prstGeom>
+                    <a:ln>
+                      <a:noFill/>
+                    </a:ln>
+                    <a:extLst>
+                      <a:ext uri="{53640926-AAD7-44D8-BBD7-CCE9431645EC}">
+                        <a14:shadowObscured xmlns:a14="http://schemas.microsoft.com/office/drawing/2010/main"/>
+                      </a:ext>
+                    </a:extLst>
+                  </pic:spPr>
+                </pic:pic>
+              </a:graphicData>
+            </a:graphic>
+          </wp:inline>
+        </w:drawing>
+      </w:r>
     </w:p>
     <w:sectPr>
-      <w:footerReference w:type="default" r:id="rId31"/>
+      <w:footerReference w:type="default" r:id="rId36"/>
       <w:pgSz w:w="12240" w:h="15840"/>
       <w:pgMar w:top="1440" w:right="1440" w:bottom="1440" w:left="1814" w:header="0" w:footer="942" w:gutter="0"/>
       <w:pgBorders w:offsetFrom="page">
@@ -48254,6 +48256,7 @@
   <w:style w:type="character" w:default="1" w:styleId="DefaultParagraphFont">
     <w:name w:val="Default Paragraph Font"/>
     <w:uiPriority w:val="1"/>
+    <w:semiHidden/>
     <w:unhideWhenUsed/>
   </w:style>
   <w:style w:type="table" w:default="1" w:styleId="TableNormal">

</xml_diff>